<commit_message>
Rerun all three flood regions inside Bangladesh and update every document
With the Indian assets, grid cells and grid-level validation cells dropped,
every result was recomputed and numbers.tex and the figures rebuilt. Claims
the new numbers no longer support are rewritten in the JFRM paper, its
Supporting Information and cover letter, the technical document and the
SoftwareX draft:

- the past-flooding feature beats the flood record in Rangpur and Rajshahi
  but only matches it in Sylhet
- the radar-label gap on the 2024 floods is within noise in Sylhet
- the graph network trails measurably in Rangpur and Rajshahi and on the
  coast, and within noise in Sylhet
- the access distances outweigh the terrain in Rangpur and on the coast
- calibration holds in the riverine regions and overstates on the coast

Feature importance was computed outside any stage and went stale; it now
runs within the benchmark stage. The submission package is rebuilt.
</commit_message>
<xml_diff>
--- a/docs/paper/submission/cover_letter.docx
+++ b/docs/paper/submission/cover_letter.docx
@@ -103,7 +103,7 @@
         </w:numPr>
       </w:pPr>
       <w:r>
-        <w:t xml:space="preserve">Trained on floods up to 2022, a gradient-boosted model ranked the ground the 2024 floods reached at 0.815 and 0.825 in the two riverine regions, below the radar record of earlier flooding at 0.905 and 0.868. Given that record as a feature, the model beat both, at 0.928 and 0.921, because terrain still ranks the ground no earlier flood reached. On the cyclone-affected coast, where most flooded assets stood on ground that had not flooded before, the model beat the record.</w:t>
+        <w:t xml:space="preserve">Trained on floods up to 2022, a gradient-boosted model ranked the ground the 2024 floods reached at 0.801 and 0.797 in the two riverine regions, below the radar record of earlier flooding at 0.896 and 0.851. Given that record as a feature, the model beat both in Rangpur and Rajshahi, at 0.924, because terrain still ranks the ground no earlier flood reached, and in Sylhet it matched the record. On the cyclone-affected coast, where most flooded assets stood on ground that had not flooded before, the model beat the record.</w:t>
       </w:r>
     </w:p>
     <w:p>
@@ -115,7 +115,7 @@
         </w:numPr>
       </w:pPr>
       <w:r>
-        <w:t xml:space="preserve">Training on radar-observed extents rather than terrain-threshold labels raised the AUC by 0.064 to 0.125 on held-out areas, and by 0.042 to 0.123 against the 2024 floods, which neither label source had seen.</w:t>
+        <w:t xml:space="preserve">Training on radar-observed extents rather than terrain-threshold labels raised the AUC by 0.080 to 0.101 on held-out areas, and by 0.024 to 0.071 against the 2024 floods, which neither label source had seen.</w:t>
       </w:r>
     </w:p>
     <w:p>

</xml_diff>

<commit_message>
Flood paper: block-size check (20 and 40 km) and the elevation-model choice
The 10 km blocks are narrower than the fitted variogram ranges (about 115, 14
and 31 km), so the default model and the record-versus-model test are rerun
with 20 and 40 km blocks. Held-out AUC falls slightly; the riverine record
lead grows and stays significant; the coastal model lead falls within noise,
and the abstract, results, discussion and cover letter now say so. SRTM over
FABDEM is explained by FABDEM's NC-SA licence against the CC BY 4.0 archive.
</commit_message>
<xml_diff>
--- a/docs/paper/submission/cover_letter.docx
+++ b/docs/paper/submission/cover_letter.docx
@@ -103,7 +103,7 @@
         </w:numPr>
       </w:pPr>
       <w:r>
-        <w:t xml:space="preserve">Trained on floods up to 2022, a gradient-boosted model ranked the ground the 2024 floods reached at 0.801 and 0.797 in the two riverine regions, below the radar record of earlier flooding at 0.896 and 0.851. Given that record as a feature, the model beat both in Rangpur and Rajshahi, at 0.924, because terrain still ranks the ground no earlier flood reached, and in Sylhet it matched the record. On the cyclone-affected coast, where most flooded assets stood on ground that had not flooded before, the model beat the record.</w:t>
+        <w:t xml:space="preserve">Trained on floods up to 2022, a gradient-boosted model ranked the ground the 2024 floods reached at 0.801 and 0.797 in the two riverine regions, below the radar record of earlier flooding at 0.896 and 0.851. Given that record as a feature, the model beat both in Rangpur and Rajshahi, at 0.924, because terrain still ranks the ground no earlier flood reached, and in Sylhet it matched the record. On the cyclone-affected coast, where most flooded assets stood on ground that had not flooded before, the model beat the record, although that lead fell within noise with wider validation blocks, while the riverine result grew stronger.</w:t>
       </w:r>
     </w:p>
     <w:p>
@@ -151,7 +151,7 @@
         <w:pStyle w:val="BodyText"/>
       </w:pPr>
       <w:r>
-        <w:t xml:space="preserve">The main text runs to about 5,500 words, excluding references, figures and tables, with 7 figures and 7 tables. The manuscript is original, has not been published, and is not under consideration elsewhere. The open-source software used here is described in a separate manuscript under review at SoftwareX (SOFTX-D-26-01375), which reports the software and its validation design and applies it across the whole country; this manuscript reports the scientific findings for the three study regions. The software paper repeats a few of the validation figures given here, as examples of what the software produces, but does not analyse them. I am its sole author and approve its submission. I declare an affiliation with Fermium Systems, which hosts the public dashboard described in the paper. The software is released under the MIT licence and the data under open licences, and no result depends on a proprietary component. The work received no specific funding.</w:t>
+        <w:t xml:space="preserve">The main text runs to about 5,800 words, excluding references, figures and tables, with 7 figures and 7 tables. The manuscript is original, has not been published, and is not under consideration elsewhere. The open-source software used here is described in a separate manuscript under review at SoftwareX (SOFTX-D-26-01375), which reports the software and its validation design and applies it across the whole country; this manuscript reports the scientific findings for the three study regions. The software paper repeats a few of the validation figures given here, as examples of what the software produces, but does not analyse them. I am its sole author and approve its submission. I declare an affiliation with Fermium Systems, which hosts the public dashboard described in the paper. The software is released under the MIT licence and the data under open licences, and no result depends on a proprietary component. The work received no specific funding.</w:t>
       </w:r>
     </w:p>
     <w:p>

</xml_diff>

<commit_message>
Flood paper: robustness of the record-versus-model test, held-out hazard-surface scores
Fixes from a critical review:
- Events re-mapped from Sentinel-1A alone (scripts/remap_s1a.py), since
  Sentinel-1B's loss in Dec 2021 left fewer scenes in the 2024 windows; the
  Rangpur-Rajshahi result is unchanged and Sylhet's masks are identical.
- Model retrained on fairer targets (any earlier flood, flood fraction): the
  record's lead grows in Rangpur-Rajshahi and closes in Sylhet, which the
  abstract, results, discussion and conclusions now say.
- Terrain hazard surface scored on held-out cells over 20 refits (Sylhet
  0.822 -> 0.763).
- 2024 floods in Rangpur-Rajshahi shown to be small (4.9-8.3 % vs 19.9-24.8 %).
- Table 5 labelled as the default assignment with its rank among the 20.
- New SI section S5 and Table S1 collect every check.
</commit_message>
<xml_diff>
--- a/docs/paper/submission/cover_letter.docx
+++ b/docs/paper/submission/cover_letter.docx
@@ -103,7 +103,7 @@
         </w:numPr>
       </w:pPr>
       <w:r>
-        <w:t xml:space="preserve">Trained on floods up to 2022, a gradient-boosted model ranked the ground the 2024 floods reached at 0.801 and 0.797 in the two riverine regions, below the radar record of earlier flooding at 0.896 and 0.851. Given that record as a feature, the model beat both in Rangpur and Rajshahi, at 0.924, because terrain still ranks the ground no earlier flood reached, and in Sylhet it matched the record. On the cyclone-affected coast, where most flooded assets stood on ground that had not flooded before, the model beat the record, although that lead fell within noise with wider validation blocks, while the riverine result grew stronger.</w:t>
+        <w:t xml:space="preserve">Trained on floods up to 2022, a gradient-boosted model ranked the ground the 2024 floods reached at 0.801 and 0.797 in the two riverine regions, below the radar record of earlier flooding at 0.896 and 0.851, although in Sylhet the gap closed when the model learned the same target as the test. In Rangpur and Rajshahi the record’s lead survived every check the manuscript applies, including masks re-mapped from a single satellite and wider validation blocks. Given that record as a feature, the model beat both in Rangpur and Rajshahi, at 0.924, because terrain still ranks the ground no earlier flood reached, and in Sylhet it matched the record. On the cyclone-affected coast, where most flooded assets stood on ground that had not flooded before, the model beat the record, although that lead fell within noise with wider validation blocks, while the riverine result grew stronger.</w:t>
       </w:r>
     </w:p>
     <w:p>
@@ -143,7 +143,7 @@
         <w:pStyle w:val="BodyText"/>
       </w:pPr>
       <w:r>
-        <w:t xml:space="preserve">The manuscript states its limits plainly. The radar flood maps agree only moderately with an independent MODIS flood map (critical success index 0.29 and 0.34), the coastal hazard surface is close to chance, and the composite risk has not yet been checked against losses. Every number in the text is generated directly from the pipeline outputs, the code is openly available at https://github.com/rakibhhridoy/rimes-mapathon, and the input data and outputs are archived at https://doi.org/10.5281/zenodo.23108572. A Supporting Information file gives the full pipeline settings and a sensitivity analysis of the risk weights.</w:t>
+        <w:t xml:space="preserve">The manuscript states its limits plainly. The radar flood maps agree only moderately with an independent MODIS flood map (critical success index 0.29 and 0.34), the coastal hazard surface is weak, and the composite risk has not yet been checked against losses. Every number in the text is generated directly from the pipeline outputs, the code is openly available at https://github.com/rakibhhridoy/rimes-mapathon, and the input data and outputs are archived at https://doi.org/10.5281/zenodo.23108572. A Supporting Information file gives the full pipeline settings and a sensitivity analysis of the risk weights.</w:t>
       </w:r>
     </w:p>
     <w:p>

</xml_diff>

<commit_message>
Flood paper: Jamuna east as an independent validation region; block-bootstrap intervals for the out-of-fold comparison
</commit_message>
<xml_diff>
--- a/docs/paper/submission/cover_letter.docx
+++ b/docs/paper/submission/cover_letter.docx
@@ -104,6 +104,18 @@
       </w:pPr>
       <w:r>
         <w:t xml:space="preserve">Trained on floods up to 2022, a gradient-boosted model ranked the ground the 2024 floods reached at 0.801 and 0.797 in the two riverine regions, below the radar record of earlier flooding at 0.896 and 0.851, although in Sylhet the gap closed when the model learned the same target as the test. In Rangpur and Rajshahi the record’s lead survived every check the manuscript applies, including masks re-mapped from a single satellite and wider validation blocks. Given that record as a feature, the model beat both in Rangpur and Rajshahi, at 0.924, because terrain still ranks the ground no earlier flood reached, and in Sylhet it matched the record. On the cyclone-affected coast, where most flooded assets stood on ground that had not flooded before, the model beat the record, although that lead fell within noise with wider validation blocks, while the riverine result grew stronger.</w:t>
+      </w:r>
+    </w:p>
+    <w:p>
+      <w:pPr>
+        <w:pStyle w:val="Compact"/>
+        <w:numPr>
+          <w:ilvl w:val="0"/>
+          <w:numId w:val="1001"/>
+        </w:numPr>
+      </w:pPr>
+      <w:r>
+        <w:t xml:space="preserve">In Rangpur and Rajshahi a record built from a single earlier flood already ranked the 2024 floods above the model (0.812 against 0.768). In an independent validation region east of the Jamuna, without any asset the study regions hold, the record led again (0.940 against 0.810), although the October 2024 flood there reached only 51 mapped assets, so that lead is probable rather than established. On the coast, where the model ranked better overall, a list of the 2.5 % of assets earlier cyclones had reached still held 37 % of the assets Cyclone Remal flooded, against 9.5 % for an equally long list from the model.</w:t>
       </w:r>
     </w:p>
     <w:p>

</xml_diff>

<commit_message>
Flood paper: the record framed as the persistence baseline forecasts are scored against; skill over the record in the abstract and discussion; graph network condensed
</commit_message>
<xml_diff>
--- a/docs/paper/submission/cover_letter.docx
+++ b/docs/paper/submission/cover_letter.docx
@@ -83,7 +83,7 @@
         <w:pStyle w:val="BodyText"/>
       </w:pPr>
       <w:r>
-        <w:t xml:space="preserve">Flood susceptibility maps are widely produced to guide where flood risk should be managed, and in Bangladesh the studies closest to this one report areas under the ROC curve (AUC) of 0.87 to 0.98. Those figures are rarely set against the simplest alternative a flood manager already holds, the record of where floods have been, and they usually come from random splits of spatially clustered points, which test a model beside its own training data. The manuscript tests both points in three regions with contrasting flood regimes, using flood extents mapped from Sentinel-1 radar for thirteen events and scoring every model on 10 km blocks held out from training over twenty block assignments.</w:t>
+        <w:t xml:space="preserve">Flood susceptibility maps are widely produced to guide where flood risk should be managed, and in Bangladesh the studies closest to this one report areas under the ROC curve (AUC) of 0.87 to 0.98. Weather and river forecasts are routinely scored against persistence, yet those figures are rarely set against its equivalent, which a flood manager already holds, the record of where floods have been, and they usually come from random splits of spatially clustered points, which test a model beside its own training data. The manuscript tests both points in three regions with contrasting flood regimes, using flood extents mapped from Sentinel-1 radar for thirteen events and scoring every model on 10 km blocks held out from training over twenty block assignments.</w:t>
       </w:r>
     </w:p>
     <w:p>
@@ -139,7 +139,7 @@
         </w:numPr>
       </w:pPr>
       <w:r>
-        <w:t xml:space="preserve">A graph neural network linking neighbouring assets added nothing over ordinary tabular models, and elevation carried almost all of the terrain signal, while the topographic wetness index and height above nearest drainage added almost nothing.</w:t>
+        <w:t xml:space="preserve">Scored as forecasts are scored against persistence, the model’s skill over the record, the share of the record’s ranking error it removes, was −0.905 in Rangpur and Rajshahi and 0.276 once the model was given the record as a feature, a measure any study with a radar flood history can report. A graph neural network linking neighbouring assets added nothing over ordinary tabular models, and elevation carried almost all of the terrain signal.</w:t>
       </w:r>
     </w:p>
     <w:p>
@@ -163,7 +163,7 @@
         <w:pStyle w:val="BodyText"/>
       </w:pPr>
       <w:r>
-        <w:t xml:space="preserve">The main text runs to about 5,700 words, excluding references, figures and tables, with 7 figures and 7 tables. The manuscript is original, has not been published, and is not under consideration elsewhere. The open-source software used here is described in a separate manuscript under review at SoftwareX (SOFTX-D-26-01375), which reports the software and its validation design and applies it across the whole country; this manuscript reports the scientific findings for the three study regions. The software paper repeats a few of the validation figures given here, as examples of what the software produces, but does not analyse them. I am its sole author and approve its submission. I declare an affiliation with Fermium Systems, which hosts the public dashboard described in the paper. The software is released under the MIT licence and the data under open licences, and no result depends on a proprietary component. The work received no specific funding.</w:t>
+        <w:t xml:space="preserve">The main text runs to just under 6,000 words, excluding references, figures and tables, with 7 figures and 7 tables. The manuscript is original, has not been published, and is not under consideration elsewhere. The open-source software used here is described in a separate manuscript under review at SoftwareX (SOFTX-D-26-01375), which reports the software and its validation design and applies it across the whole country; this manuscript reports the scientific findings for the three study regions. The software paper repeats a few of the validation figures given here, as examples of what the software produces, but does not analyse them. I am its sole author and approve its submission. I declare an affiliation with Fermium Systems, which hosts the public dashboard described in the paper. The software is released under the MIT licence and the data under open licences, and no result depends on a proprietary component. The work received no specific funding.</w:t>
       </w:r>
     </w:p>
     <w:p>

</xml_diff>

<commit_message>
Flood paper: every flood year against the record in seven regions, the new-ground rule, the JRC hazard map; graph network, Kriging and composite risk moved to the SI
- Results 'Every flood year' with Table 7 and Fig. 5 (record lead against new ground, Molchan trajectories)
- Related work: past events as the reference (Zechar and Jordan 2008, Chainey et al. 2008, Jones et al. 2021)
- Methods: rolling origin, validation regions, JRC hazard map, water occurrence, area skill score, prediction accuracy index
- Discussion, implications, limits, conclusions, abstract and cover letter rewritten; 5,818/6,000 words
- SI S7 graph network and tabular models, S8 hazard surfaces; union risk map in S2
</commit_message>
<xml_diff>
--- a/docs/paper/submission/cover_letter.docx
+++ b/docs/paper/submission/cover_letter.docx
@@ -103,7 +103,7 @@
         </w:numPr>
       </w:pPr>
       <w:r>
-        <w:t xml:space="preserve">Trained on floods up to 2022, a gradient-boosted model ranked the ground the 2024 floods reached at 0.801 and 0.797 in the two riverine regions, below the radar record of earlier flooding at 0.896 and 0.851, although in Sylhet the gap closed when the model learned the same target as the test. In Rangpur and Rajshahi the record’s lead survived every check the manuscript applies, including masks re-mapped from a single satellite and wider validation blocks. Given that record as a feature, the model beat both in Rangpur and Rajshahi, at 0.924, because terrain still ranks the ground no earlier flood reached, and in Sylhet it matched the record. On the cyclone-affected coast, where most flooded assets stood on ground that had not flooded before, the model beat the record, although that lead fell within noise with wider validation blocks, while the riverine result grew stronger.</w:t>
+        <w:t xml:space="preserve">Predicting each flood year from the years before it, in the three study regions and four validation regions that share no asset with them, gives 15 tests. The record’s lead over a gradient-boosted terrain model fell as the share of a flood reaching ground no earlier flood had reached rose (Spearman ρ = −0.775, p &lt; 0.001), whatever the length of the record, and the two were level at about 33 % of flooded assets on such new ground (95 % interval 18–41 %). The comparison therefore has an answer that depends on the flood regime rather than a single verdict.</w:t>
       </w:r>
     </w:p>
     <w:p>
@@ -115,7 +115,7 @@
         </w:numPr>
       </w:pPr>
       <w:r>
-        <w:t xml:space="preserve">In Rangpur and Rajshahi a record built from a single earlier flood already ranked the 2024 floods above the model (0.812 against 0.768). In an independent validation region east of the Jamuna, without any asset the study regions hold, the record led again (0.940 against 0.810), although the October 2024 flood there reached only 51 mapped assets, so that lead is probable rather than established. On the coast, where the model ranked better overall, a list of the 2.5 % of assets earlier cyclones had reached still held 37 % of the assets Cyclone Remal flooded, against 9.5 % for an equally long list from the model.</w:t>
+        <w:t xml:space="preserve">In Rangpur and Rajshahi, where few of the 2024 floods’ assets stood on new ground, the record ranked the flooding at 0.896 against 0.801 for the model and kept its lead under every check the manuscript applies, including masks re-mapped from a single satellite and wider validation blocks. On the cyclone-affected coast, where most flooding reached new ground, the model led. Given the record as a feature, the model beat both of its parts in 5 of 8 tests, all riverine.</w:t>
       </w:r>
     </w:p>
     <w:p>
@@ -127,7 +127,7 @@
         </w:numPr>
       </w:pPr>
       <w:r>
-        <w:t xml:space="preserve">Training on radar-observed extents rather than terrain-threshold labels raised the AUC by 0.080 to 0.101 on held-out areas, and by 0.024 to 0.071 against the 2024 floods, which neither label source had seen.</w:t>
+        <w:t xml:space="preserve">A global hydrodynamic hazard map (JRC, LISFLOOD-FP) was no stronger a rival than the model, trailing the record significantly in 5 of 15 tests and leading it in 4, all on floods that reached much new ground. The comparison thus bears on hazard maps generally, as it has long done in earthquake forecasting, where maps of past seismicity remain the reference that forecasts must beat.</w:t>
       </w:r>
     </w:p>
     <w:p>
@@ -139,7 +139,7 @@
         </w:numPr>
       </w:pPr>
       <w:r>
-        <w:t xml:space="preserve">Scored as forecasts are scored against persistence, the model’s skill over the record, the share of the record’s ranking error it removes, was −0.905 in Rangpur and Rajshahi and 0.276 once the model was given the record as a feature, a measure any study with a radar flood history can report. A graph neural network linking neighbouring assets added nothing over ordinary tabular models, and elevation carried almost all of the terrain signal.</w:t>
+        <w:t xml:space="preserve">Training on radar-observed extents rather than terrain-threshold labels raised the AUC by 0.080 to 0.101 on held-out areas, and by 0.024 to 0.071 against the 2024 floods, which neither label source had seen.</w:t>
       </w:r>
     </w:p>
     <w:p>
@@ -147,7 +147,7 @@
         <w:pStyle w:val="FirstParagraph"/>
       </w:pPr>
       <w:r>
-        <w:t xml:space="preserve">I believe the paper suits the Journal because its conclusions concern how flood risk is managed as much as how it is modelled. It recommends that agencies publish the radar flood record as a planning baseline wherever one exists, that maps used to site shelters, embankments or schools be judged on held-out areas and later floods, and that areas without mapped infrastructure be treated as missing data rather than as safe. It also engages the Journal’s own work on flood hazard mapping in Bangladesh, radar flood mapping, infrastructure exposure and vulnerability.</w:t>
+        <w:t xml:space="preserve">I believe the paper suits the Journal because its conclusions concern how flood risk is managed as much as how it is modelled. It recommends that agencies publish the radar flood record as a planning baseline wherever one exists, that the choice between that record and a model follow how much of past floods fell on new ground, and that maps used to site shelters, embankments or schools be judged on held-out areas and later floods. It also engages the Journal’s own work on flood hazard mapping in Bangladesh, radar flood mapping, infrastructure exposure and vulnerability.</w:t>
       </w:r>
     </w:p>
     <w:p>
@@ -163,7 +163,7 @@
         <w:pStyle w:val="BodyText"/>
       </w:pPr>
       <w:r>
-        <w:t xml:space="preserve">The main text runs to just under 6,000 words, excluding references, figures and tables, with 7 figures and 7 tables. The manuscript is original, has not been published, and is not under consideration elsewhere. The open-source software used here is described in a separate manuscript under review at SoftwareX (SOFTX-D-26-01375), which reports the software and its validation design and applies it across the whole country; this manuscript reports the scientific findings for the three study regions. The software paper repeats a few of the validation figures given here, as examples of what the software produces, but does not analyse them. I am its sole author and approve its submission. I declare an affiliation with Fermium Systems, which hosts the public dashboard described in the paper. The software is released under the MIT licence and the data under open licences, and no result depends on a proprietary component. The work received no specific funding.</w:t>
+        <w:t xml:space="preserve">The main text runs to just under 6,000 words, excluding references, figures and tables, with 6 figures and 7 tables. The manuscript is original, has not been published, and is not under consideration elsewhere. The open-source software used here is described in a separate manuscript under review at SoftwareX (SOFTX-D-26-01375), which reports the software and its validation design and applies it across the whole country; this manuscript reports the scientific findings for the three study regions. The software paper repeats a few of the validation figures given here, as examples of what the software produces, but does not analyse them. I am its sole author and approve its submission. I declare an affiliation with Fermium Systems, which hosts the public dashboard described in the paper. The software is released under the MIT licence and the data under open licences, and no result depends on a proprietary component. The work received no specific funding.</w:t>
       </w:r>
     </w:p>
     <w:p>

</xml_diff>

<commit_message>
Cover letter: lead with the record as a free baseline; region-level checks and current limits
</commit_message>
<xml_diff>
--- a/docs/paper/submission/cover_letter.docx
+++ b/docs/paper/submission/cover_letter.docx
@@ -83,7 +83,7 @@
         <w:pStyle w:val="BodyText"/>
       </w:pPr>
       <w:r>
-        <w:t xml:space="preserve">Flood susceptibility maps are widely produced to guide where flood risk should be managed, and in Bangladesh the studies closest to this one report areas under the ROC curve (AUC) of 0.87 to 0.98. Weather and river forecasts are routinely scored against persistence, yet those figures are rarely set against its equivalent, which a flood manager already holds, the record of where floods have been, and they usually come from random splits of spatially clustered points, which test a model beside its own training data. The manuscript tests both points in three regions with contrasting flood regimes, using flood extents mapped from Sentinel-1 radar for thirteen events and scoring every model on 10 km blocks held out from training over twenty block assignments.</w:t>
+        <w:t xml:space="preserve">Every flood manager in a radar-mapped region already holds a free flood map, the record of where floods have been, yet published flood susceptibility maps are almost never tested against it. Weather and river forecasts must beat persistence before their skill is believed, while susceptibility studies in Bangladesh report areas under the ROC curve (AUC) of 0.87 to 0.98, usually from random splits of spatially clustered points that test a model beside its own training data. The manuscript sets the model against the record on later floods, using flood extents mapped from Sentinel-1 radar and scoring every model on 10 km blocks held out from training, and asks when the record is enough and when a model adds to it.</w:t>
       </w:r>
     </w:p>
     <w:p>
@@ -103,7 +103,7 @@
         </w:numPr>
       </w:pPr>
       <w:r>
-        <w:t xml:space="preserve">Predicting each flood year from the years before it, in the three study regions and four validation regions that share no asset with them, gives 15 tests. The record’s lead over a gradient-boosted terrain model fell as the share of a flood reaching ground no earlier flood had reached rose (Spearman ρ = −0.775, p &lt; 0.001), whatever the length of the record, and the two were level at about 33 % of flooded assets on such new ground (95 % interval 18–41 %). The comparison therefore has an answer that depends on the flood regime rather than a single verdict.</w:t>
+        <w:t xml:space="preserve">Predicting each flood year from the years before it, in the three study regions and four validation regions that share no asset with them, gives 15 tests. The record’s lead over a gradient-boosted terrain model fell as the share of a flood reaching ground no earlier flood had reached rose (Spearman ρ = −0.775, p &lt; 0.001), whatever the length of the record, and the two were level at about 33 % of flooded assets on such new ground (95 % interval 18–41 %, or 3–43 % when whole regions are resampled). The relation held with each region left out in turn and within every region with more than one test, so the answer depends on the flood regime rather than resting on one region or one year.</w:t>
       </w:r>
     </w:p>
     <w:p>
@@ -127,7 +127,7 @@
         </w:numPr>
       </w:pPr>
       <w:r>
-        <w:t xml:space="preserve">A global hydrodynamic hazard map (JRC, LISFLOOD-FP) was no stronger a rival than the model, trailing the record significantly in 5 of 15 tests and leading it in 4, all on floods that reached much new ground. The comparison thus bears on hazard maps generally, as it has long done in earthquake forecasting, where maps of past seismicity remain the reference that forecasts must beat.</w:t>
+        <w:t xml:space="preserve">A global hydrodynamic hazard map (JRC, LISFLOOD-FP), a fair rival only for river flooding, was no stronger than the model, trailing the record significantly in 5 of 15 tests and leading it in 4, all on floods that reached much new ground. The comparison thus bears on hazard maps generally, as it has long done in earthquake forecasting, where maps of past seismicity remain the reference that forecasts must beat.</w:t>
       </w:r>
     </w:p>
     <w:p>
@@ -155,7 +155,7 @@
         <w:pStyle w:val="BodyText"/>
       </w:pPr>
       <w:r>
-        <w:t xml:space="preserve">The manuscript states its limits plainly. The radar flood maps agree only moderately with an independent MODIS flood map (critical success index 0.29 and 0.34), the coastal hazard surface is weak, and the composite risk has not yet been checked against losses. Every number in the text is generated directly from the pipeline outputs, the code is openly available at https://github.com/rakibhhridoy/rimes-mapathon, and the input data and outputs are archived at https://doi.org/10.5281/zenodo.23573843. A Supporting Information file gives the full pipeline settings and a sensitivity analysis of the risk weights.</w:t>
+        <w:t xml:space="preserve">The manuscript states its limits plainly. The radar flood maps agree only moderately with an independent MODIS flood map (critical success index 0.29 and 0.34), so every score measures agreement with flooding as radar sees it, 10 of the 15 tests cannot separate the record from the model, and the crossover near a third of flooding on new ground is estimated from seven regions of one country. Every number in the text is generated directly from the pipeline outputs, the code is openly available at https://github.com/rakibhhridoy/rimes-mapathon, and the input data and outputs are archived at https://doi.org/10.5281/zenodo.23573843. A Supporting Information file gives the pipeline settings, the robustness checks, the graph network and tabular model comparison, and the region-level analysis of the tests.</w:t>
       </w:r>
     </w:p>
     <w:p>

</xml_diff>

<commit_message>
Black Times headings in Word files, one-page cover letter, turnitin.docx with main text and SI
</commit_message>
<xml_diff>
--- a/docs/paper/submission/cover_letter.docx
+++ b/docs/paper/submission/cover_letter.docx
@@ -10,22 +10,72 @@
         <w:t xml:space="preserve">Md Rakib Hasan</w:t>
       </w:r>
       <w:r>
+        <w:br/>
+      </w:r>
+      <w:r>
+        <w:t xml:space="preserve">Department of Soil, Water and Environment, University of Dhaka, Dhaka-1000, Bangladesh</w:t>
+      </w:r>
+      <w:r>
+        <w:br/>
+      </w:r>
+      <w:r>
+        <w:t xml:space="preserve">Fermium Systems, Dhaka-1207, Bangladesh</w:t>
+      </w:r>
+      <w:r>
+        <w:br/>
+      </w:r>
+      <w:r>
+        <w:t xml:space="preserve">rakibhhridoy@fermium.systems · ORCID 0009-0002-4007-7590</w:t>
+      </w:r>
+    </w:p>
+    <w:p>
+      <w:pPr>
+        <w:pStyle w:val="BodyText"/>
+      </w:pPr>
+      <w:r>
+        <w:t xml:space="preserve">24 October 2026</w:t>
+      </w:r>
+    </w:p>
+    <w:p>
+      <w:pPr>
+        <w:pStyle w:val="BodyText"/>
+      </w:pPr>
+      <w:r>
+        <w:t xml:space="preserve">The Editor</w:t>
+      </w:r>
+      <w:r>
+        <w:br/>
+      </w:r>
+      <w:r>
+        <w:t xml:space="preserve">Journal of Flood Risk Management</w:t>
+      </w:r>
+    </w:p>
+    <w:p>
+      <w:pPr>
+        <w:pStyle w:val="BodyText"/>
+      </w:pPr>
+      <w:r>
+        <w:t xml:space="preserve">Dear Editor,</w:t>
+      </w:r>
+    </w:p>
+    <w:p>
+      <w:pPr>
+        <w:pStyle w:val="BodyText"/>
+      </w:pPr>
+      <w:r>
+        <w:t xml:space="preserve">I am pleased to submit the manuscript</w:t>
+      </w:r>
+      <w:r>
         <w:t xml:space="preserve"> </w:t>
       </w:r>
       <w:r>
-        <w:t xml:space="preserve">Department of Soil, Water and Environment, University of Dhaka, Dhaka-1000, Bangladesh</w:t>
+        <w:t xml:space="preserve">“When do flood susceptibility models beat the flood record? Evidence from radar-observed floods in Bangladesh”</w:t>
       </w:r>
       <w:r>
         <w:t xml:space="preserve"> </w:t>
       </w:r>
       <w:r>
-        <w:t xml:space="preserve">Fermium Systems, Dhaka-1207, Bangladesh</w:t>
-      </w:r>
-      <w:r>
-        <w:t xml:space="preserve"> </w:t>
-      </w:r>
-      <w:r>
-        <w:t xml:space="preserve">rakibhhridoy@fermium.systems · ORCID 0009-0002-4007-7590</w:t>
+        <w:t xml:space="preserve">for consideration as an Original Paper in the Journal of Flood Risk Management.</w:t>
       </w:r>
     </w:p>
     <w:p>
@@ -33,7 +83,7 @@
         <w:pStyle w:val="BodyText"/>
       </w:pPr>
       <w:r>
-        <w:t xml:space="preserve">23 October 2026</w:t>
+        <w:t xml:space="preserve">Every flood manager in a radar-mapped region already holds a free flood map, the record of where floods have been, yet published flood susceptibility maps are almost never tested against it. The manuscript sets a gradient-boosted terrain model against that record on later floods mapped from Sentinel-1 radar, scoring both on 10 km blocks held out from training, and asks when the record is enough and when a model adds to it.</w:t>
       </w:r>
     </w:p>
     <w:p>
@@ -41,13 +91,7 @@
         <w:pStyle w:val="BodyText"/>
       </w:pPr>
       <w:r>
-        <w:t xml:space="preserve">The Editor</w:t>
-      </w:r>
-      <w:r>
-        <w:t xml:space="preserve"> </w:t>
-      </w:r>
-      <w:r>
-        <w:t xml:space="preserve">Journal of Flood Risk Management</w:t>
+        <w:t xml:space="preserve">Across 15 tests in seven regions, the record’s lead fell as the share of a flood reaching ground no earlier flood had reached rose (Spearman ρ = −0.775, p &lt; 0.001), and the two were level at about a third of flooded assets on new ground. The relation held with each region left out in turn. Where floods returned to the same ground the record won (AUC 0.896 against 0.801 in Rangpur and Rajshahi), and on the cyclone-affected coast the model led. A global hydrodynamic hazard map was no stronger than the model.</w:t>
       </w:r>
     </w:p>
     <w:p>
@@ -55,7 +99,7 @@
         <w:pStyle w:val="BodyText"/>
       </w:pPr>
       <w:r>
-        <w:t xml:space="preserve">Dear Editor,</w:t>
+        <w:t xml:space="preserve">The paper suits the Journal because its conclusions concern how flood risk is managed. It recommends that agencies publish the radar flood record as a planning baseline, and that the choice between record and model follow how much of past flooding fell on new ground. Its limits are stated plainly: scores measure agreement with flooding as radar sees it, 10 of the 15 tests cannot separate record from model, and all regions lie in one country. The code is at https://github.com/rakibhhridoy/rimes-mapathon and the data at https://doi.org/10.5281/zenodo.23573843.</w:t>
       </w:r>
     </w:p>
     <w:p>
@@ -63,19 +107,7 @@
         <w:pStyle w:val="BodyText"/>
       </w:pPr>
       <w:r>
-        <w:t xml:space="preserve">I am pleased to submit the manuscript</w:t>
-      </w:r>
-      <w:r>
-        <w:t xml:space="preserve"> </w:t>
-      </w:r>
-      <w:r>
-        <w:t xml:space="preserve">“When do flood susceptibility models beat the flood record? Evidence from radar-observed floods in Bangladesh”</w:t>
-      </w:r>
-      <w:r>
-        <w:t xml:space="preserve"> </w:t>
-      </w:r>
-      <w:r>
-        <w:t xml:space="preserve">for consideration as an Original Paper in the Journal of Flood Risk Management.</w:t>
+        <w:t xml:space="preserve">The main text runs to just under 6,000 words with 5 figures and 7 tables, plus a Supporting Information file. The manuscript is original and not under consideration elsewhere. The software it uses is described in a separate manuscript under review at SoftwareX (SOFTX-D-26-01375), which reports the software rather than these findings. I am the sole author, declare an affiliation with Fermium Systems, which hosts the public dashboard, and received no specific funding.</w:t>
       </w:r>
     </w:p>
     <w:p>
@@ -83,15 +115,7 @@
         <w:pStyle w:val="BodyText"/>
       </w:pPr>
       <w:r>
-        <w:t xml:space="preserve">Every flood manager in a radar-mapped region already holds a free flood map, the record of where floods have been, yet published flood susceptibility maps are almost never tested against it. Weather and river forecasts must beat persistence before their skill is believed, while susceptibility studies in Bangladesh report areas under the ROC curve (AUC) of 0.87 to 0.98, usually from random splits of spatially clustered points that test a model beside its own training data. The manuscript sets the model against the record on later floods, using flood extents mapped from Sentinel-1 radar and scoring every model on 10 km blocks held out from training, and asks when the record is enough and when a model adds to it.</w:t>
-      </w:r>
-    </w:p>
-    <w:p>
-      <w:pPr>
-        <w:pStyle w:val="BodyText"/>
-      </w:pPr>
-      <w:r>
-        <w:t xml:space="preserve">The main findings are these.</w:t>
+        <w:t xml:space="preserve">Suggested reviewers:</w:t>
       </w:r>
     </w:p>
     <w:p>
@@ -103,7 +127,7 @@
         </w:numPr>
       </w:pPr>
       <w:r>
-        <w:t xml:space="preserve">Predicting each flood year from the years before it, in the three study regions and four validation regions that share no asset with them, gives 15 tests. The record’s lead over a gradient-boosted terrain model fell as the share of a flood reaching ground no earlier flood had reached rose (Spearman ρ = −0.775, p &lt; 0.001), whatever the length of the record, and the two were level at about 33 % of flooded assets on such new ground (95 % interval 18–41 %, or 3–43 % when whole regions are resampled). The relation held with each region left out in turn and within every region with more than one test, so the answer depends on the flood regime rather than resting on one region or one year.</w:t>
+        <w:t xml:space="preserve">Dr Beth Tellman, Nelson Institute for Environmental Studies, University of Wisconsin–Madison, USA. Beth.tellman@wisc.edu</w:t>
       </w:r>
     </w:p>
     <w:p>
@@ -115,7 +139,7 @@
         </w:numPr>
       </w:pPr>
       <w:r>
-        <w:t xml:space="preserve">In Rangpur and Rajshahi, where few of the 2024 floods’ assets stood on new ground, the record ranked the flooding at 0.896 against 0.801 for the model and kept its lead under every check the manuscript applies, including masks re-mapped from a single satellite and wider validation blocks. On the cyclone-affected coast, where most flooding reached new ground, the model led. Given the record as a feature, the model beat both of its parts in 5 of 8 tests, all riverine.</w:t>
+        <w:t xml:space="preserve">Dr Sandro Martinis, German Remote Sensing Data Center, German Aerospace Center (DLR), Germany. Sandro.Martinis@dlr.de</w:t>
       </w:r>
     </w:p>
     <w:p>
@@ -127,7 +151,7 @@
         </w:numPr>
       </w:pPr>
       <w:r>
-        <w:t xml:space="preserve">A global hydrodynamic hazard map (JRC, LISFLOOD-FP), a fair rival only for river flooding, was no stronger than the model, trailing the record significantly in 5 of 15 tests and leading it in 4, all on floods that reached much new ground. The comparison thus bears on hazard maps generally, as it has long done in earthquake forecasting, where maps of past seismicity remain the reference that forecasts must beat.</w:t>
+        <w:t xml:space="preserve">Prof. Hanna Meyer, Institute of Landscape Ecology, University of Münster, Germany. hanna.meyer@uni-muenster.de</w:t>
       </w:r>
     </w:p>
     <w:p>
@@ -136,86 +160,6 @@
         <w:numPr>
           <w:ilvl w:val="0"/>
           <w:numId w:val="1001"/>
-        </w:numPr>
-      </w:pPr>
-      <w:r>
-        <w:t xml:space="preserve">Training on radar-observed extents rather than terrain-threshold labels raised the AUC by 0.080 to 0.101 on held-out areas, and by 0.024 to 0.071 against the 2024 floods, which neither label source had seen.</w:t>
-      </w:r>
-    </w:p>
-    <w:p>
-      <w:pPr>
-        <w:pStyle w:val="FirstParagraph"/>
-      </w:pPr>
-      <w:r>
-        <w:t xml:space="preserve">I believe the paper suits the Journal because its conclusions concern how flood risk is managed as much as how it is modelled. It recommends that agencies publish the radar flood record as a planning baseline wherever one exists, that the choice between that record and a model follow how much of past floods fell on new ground, and that maps used to site shelters, embankments or schools be judged on held-out areas and later floods. It also engages the Journal’s own work on flood hazard mapping in Bangladesh, radar flood mapping, infrastructure exposure and vulnerability.</w:t>
-      </w:r>
-    </w:p>
-    <w:p>
-      <w:pPr>
-        <w:pStyle w:val="BodyText"/>
-      </w:pPr>
-      <w:r>
-        <w:t xml:space="preserve">The manuscript states its limits plainly. The radar flood maps agree only moderately with an independent MODIS flood map (critical success index 0.29 and 0.34), so every score measures agreement with flooding as radar sees it, 10 of the 15 tests cannot separate the record from the model, and the crossover near a third of flooding on new ground is estimated from seven regions of one country. Every number in the text is generated directly from the pipeline outputs, the code is openly available at https://github.com/rakibhhridoy/rimes-mapathon, and the input data and outputs are archived at https://doi.org/10.5281/zenodo.23573843. A Supporting Information file gives the pipeline settings, the robustness checks, the graph network and tabular model comparison, and the region-level analysis of the tests.</w:t>
-      </w:r>
-    </w:p>
-    <w:p>
-      <w:pPr>
-        <w:pStyle w:val="BodyText"/>
-      </w:pPr>
-      <w:r>
-        <w:t xml:space="preserve">The main text runs to just under 6,000 words, excluding references, figures and tables, with 5 figures and 7 tables. The manuscript is original, has not been published, and is not under consideration elsewhere. The open-source software used here is described in a separate manuscript under review at SoftwareX (SOFTX-D-26-01375), which reports the software and its validation design and applies it across the whole country; this manuscript reports the scientific findings for the three study regions. The software paper repeats a few of the validation figures given here, as examples of what the software produces, but does not analyse them. I am its sole author and approve its submission. I declare an affiliation with Fermium Systems, which hosts the public dashboard described in the paper. The software is released under the MIT licence and the data under open licences, and no result depends on a proprietary component. The work received no specific funding.</w:t>
-      </w:r>
-    </w:p>
-    <w:p>
-      <w:pPr>
-        <w:pStyle w:val="BodyText"/>
-      </w:pPr>
-      <w:r>
-        <w:t xml:space="preserve">Suggested reviewers:</w:t>
-      </w:r>
-    </w:p>
-    <w:p>
-      <w:pPr>
-        <w:pStyle w:val="Compact"/>
-        <w:numPr>
-          <w:ilvl w:val="0"/>
-          <w:numId w:val="1002"/>
-        </w:numPr>
-      </w:pPr>
-      <w:r>
-        <w:t xml:space="preserve">Dr Beth Tellman, Nelson Institute for Environmental Studies, University of Wisconsin–Madison, USA. Beth.tellman@wisc.edu</w:t>
-      </w:r>
-    </w:p>
-    <w:p>
-      <w:pPr>
-        <w:pStyle w:val="Compact"/>
-        <w:numPr>
-          <w:ilvl w:val="0"/>
-          <w:numId w:val="1002"/>
-        </w:numPr>
-      </w:pPr>
-      <w:r>
-        <w:t xml:space="preserve">Dr Sandro Martinis, German Remote Sensing Data Center, German Aerospace Center (DLR), Germany. Sandro.Martinis@dlr.de</w:t>
-      </w:r>
-    </w:p>
-    <w:p>
-      <w:pPr>
-        <w:pStyle w:val="Compact"/>
-        <w:numPr>
-          <w:ilvl w:val="0"/>
-          <w:numId w:val="1002"/>
-        </w:numPr>
-      </w:pPr>
-      <w:r>
-        <w:t xml:space="preserve">Prof. Hanna Meyer, Institute of Landscape Ecology, University of Münster, Germany. hanna.meyer@uni-muenster.de</w:t>
-      </w:r>
-    </w:p>
-    <w:p>
-      <w:pPr>
-        <w:pStyle w:val="Compact"/>
-        <w:numPr>
-          <w:ilvl w:val="0"/>
-          <w:numId w:val="1002"/>
         </w:numPr>
       </w:pPr>
       <w:r>
@@ -465,9 +409,6 @@
   <w:num w:numId="1001">
     <w:abstractNumId w:val="991"/>
   </w:num>
-  <w:num w:numId="1002">
-    <w:abstractNumId w:val="991"/>
-  </w:num>
 </w:numbering>
 </file>
 
@@ -476,7 +417,7 @@
   <w:docDefaults>
     <w:rPrDefault>
       <w:rPr>
-        <w:rFonts w:asciiTheme="minorHAnsi" w:cstheme="minorBidi" w:eastAsiaTheme="minorEastAsia" w:hAnsiTheme="minorHAnsi"/>
+        <w:rFonts w:ascii="Times New Roman" w:cs="Times New Roman" w:eastAsia="Times New Roman" w:hAnsi="Times New Roman"/>
         <w:sz w:val="24"/>
         <w:szCs w:val="24"/>
         <w:lang w:bidi="ar-SA" w:eastAsia="zh-CN" w:val="en-US"/>
@@ -492,6 +433,9 @@
   <w:style w:default="1" w:styleId="Normal" w:type="paragraph">
     <w:name w:val="Normal"/>
     <w:qFormat/>
+    <w:rPr>
+      <w:rFonts w:ascii="Times New Roman" w:hAnsi="Times New Roman"/>
+    </w:rPr>
   </w:style>
   <w:style w:styleId="BodyText" w:type="paragraph">
     <w:name w:val="Body Text"/>
@@ -501,12 +445,18 @@
     <w:pPr>
       <w:spacing w:after="180" w:before="180"/>
     </w:pPr>
+    <w:rPr>
+      <w:rFonts w:ascii="Times New Roman" w:hAnsi="Times New Roman"/>
+    </w:rPr>
   </w:style>
   <w:style w:customStyle="1" w:styleId="FirstParagraph" w:type="paragraph">
     <w:name w:val="First Paragraph"/>
     <w:basedOn w:val="BodyText"/>
     <w:next w:val="BodyText"/>
     <w:qFormat/>
+    <w:rPr>
+      <w:rFonts w:ascii="Times New Roman" w:hAnsi="Times New Roman"/>
+    </w:rPr>
   </w:style>
   <w:style w:customStyle="1" w:styleId="Compact" w:type="paragraph">
     <w:name w:val="Compact"/>
@@ -515,6 +465,9 @@
     <w:pPr>
       <w:spacing w:after="36" w:before="36"/>
     </w:pPr>
+    <w:rPr>
+      <w:rFonts w:ascii="Times New Roman" w:hAnsi="Times New Roman"/>
+    </w:rPr>
   </w:style>
   <w:style w:styleId="Title" w:type="paragraph">
     <w:name w:val="Title"/>
@@ -530,8 +483,10 @@
       <w:jc w:val="center"/>
     </w:pPr>
     <w:rPr>
-      <w:rFonts w:asciiTheme="majorHAnsi" w:cstheme="majorBidi" w:eastAsiaTheme="majorEastAsia" w:hAnsiTheme="majorHAnsi"/>
-      <w:sz w:val="56"/>
+      <w:rFonts w:ascii="Times New Roman" w:cs="Times New Roman" w:eastAsia="Times New Roman" w:hAnsi="Times New Roman"/>
+      <w:b/>
+      <w:i w:val="0"/>
+      <w:sz w:val="28"/>
       <w:szCs w:val="56"/>
     </w:rPr>
   </w:style>
@@ -542,7 +497,7 @@
     <w:uiPriority w:val="10"/>
     <w:rsid w:val="00A10FD9"/>
     <w:rPr>
-      <w:rFonts w:asciiTheme="majorHAnsi" w:cstheme="majorBidi" w:eastAsiaTheme="majorEastAsia" w:hAnsiTheme="majorHAnsi"/>
+      <w:rFonts w:ascii="Times New Roman" w:cs="Times New Roman" w:eastAsia="Times New Roman" w:hAnsi="Times New Roman"/>
       <w:sz w:val="56"/>
       <w:szCs w:val="56"/>
     </w:rPr>
@@ -561,9 +516,11 @@
       </w:numPr>
     </w:pPr>
     <w:rPr>
-      <w:rFonts w:cstheme="majorBidi" w:eastAsiaTheme="majorEastAsia"/>
+      <w:rFonts w:ascii="Times New Roman" w:cs="Times New Roman" w:eastAsia="Times New Roman" w:hAnsi="Times New Roman"/>
+      <w:b w:val="0"/>
+      <w:i w:val="0"/>
       <w:spacing w:val="15"/>
-      <w:sz w:val="28"/>
+      <w:sz w:val="24"/>
       <w:szCs w:val="28"/>
     </w:rPr>
   </w:style>
@@ -574,8 +531,8 @@
     <w:uiPriority w:val="11"/>
     <w:rsid w:val="00A10FD9"/>
     <w:rPr>
-      <w:rFonts w:cstheme="majorBidi" w:eastAsiaTheme="majorEastAsia"/>
-      <w:color w:themeColor="text1" w:themeTint="A6" w:val="595959"/>
+      <w:rFonts w:ascii="Times New Roman" w:cs="Times New Roman" w:eastAsia="Times New Roman" w:hAnsi="Times New Roman"/>
+      <w:color w:val="000000"/>
       <w:spacing w:val="15"/>
       <w:sz w:val="28"/>
       <w:szCs w:val="28"/>
@@ -591,6 +548,7 @@
       <w:keepLines/>
     </w:pPr>
     <w:rPr>
+      <w:rFonts w:ascii="Times New Roman" w:hAnsi="Times New Roman"/>
       <w:sz w:val="24"/>
       <w:szCs w:val="24"/>
     </w:rPr>
@@ -605,6 +563,7 @@
       <w:keepLines/>
     </w:pPr>
     <w:rPr>
+      <w:rFonts w:ascii="Times New Roman" w:hAnsi="Times New Roman"/>
       <w:sz w:val="24"/>
       <w:szCs w:val="24"/>
     </w:rPr>
@@ -621,6 +580,7 @@
       <w:jc w:val="center"/>
     </w:pPr>
     <w:rPr>
+      <w:rFonts w:ascii="Times New Roman" w:hAnsi="Times New Roman"/>
       <w:b/>
       <w:sz w:val="20"/>
       <w:szCs w:val="20"/>
@@ -637,6 +597,7 @@
       <w:spacing w:after="300" w:before="100"/>
     </w:pPr>
     <w:rPr>
+      <w:rFonts w:ascii="Times New Roman" w:hAnsi="Times New Roman"/>
       <w:sz w:val="20"/>
       <w:szCs w:val="20"/>
     </w:rPr>
@@ -647,7 +608,9 @@
     <w:next w:val="Bibliography"/>
     <w:qFormat/>
     <w:pPr/>
-    <w:rPr/>
+    <w:rPr>
+      <w:rFonts w:ascii="Times New Roman" w:hAnsi="Times New Roman"/>
+    </w:rPr>
   </w:style>
   <w:style w:styleId="Heading1" w:type="paragraph">
     <w:name w:val="heading 1"/>
@@ -664,9 +627,11 @@
       <w:outlineLvl w:val="0"/>
     </w:pPr>
     <w:rPr>
-      <w:rFonts w:asciiTheme="majorHAnsi" w:cstheme="majorBidi" w:eastAsiaTheme="majorEastAsia" w:hAnsiTheme="majorHAnsi"/>
-      <w:color w:themeColor="accent1" w:themeShade="BF" w:val="0F4761"/>
-      <w:sz w:val="40"/>
+      <w:rFonts w:ascii="Times New Roman" w:cs="Times New Roman" w:eastAsia="Times New Roman" w:hAnsi="Times New Roman"/>
+      <w:b/>
+      <w:i w:val="0"/>
+      <w:color w:val="000000"/>
+      <w:sz w:val="24"/>
       <w:szCs w:val="40"/>
     </w:rPr>
   </w:style>
@@ -687,9 +652,11 @@
       <w:outlineLvl w:val="1"/>
     </w:pPr>
     <w:rPr>
-      <w:rFonts w:asciiTheme="majorHAnsi" w:cstheme="majorBidi" w:eastAsiaTheme="majorEastAsia" w:hAnsiTheme="majorHAnsi"/>
-      <w:color w:themeColor="accent1" w:themeShade="BF" w:val="0F4761"/>
-      <w:sz w:val="32"/>
+      <w:rFonts w:ascii="Times New Roman" w:cs="Times New Roman" w:eastAsia="Times New Roman" w:hAnsi="Times New Roman"/>
+      <w:b/>
+      <w:i/>
+      <w:color w:val="000000"/>
+      <w:sz w:val="24"/>
       <w:szCs w:val="32"/>
     </w:rPr>
   </w:style>
@@ -710,9 +677,11 @@
       <w:outlineLvl w:val="2"/>
     </w:pPr>
     <w:rPr>
-      <w:rFonts w:cstheme="majorBidi" w:eastAsiaTheme="majorEastAsia"/>
-      <w:color w:themeColor="accent1" w:themeShade="BF" w:val="0F4761"/>
-      <w:sz w:val="28"/>
+      <w:rFonts w:ascii="Times New Roman" w:cs="Times New Roman" w:eastAsia="Times New Roman" w:hAnsi="Times New Roman"/>
+      <w:b w:val="0"/>
+      <w:i/>
+      <w:color w:val="000000"/>
+      <w:sz w:val="24"/>
       <w:szCs w:val="28"/>
     </w:rPr>
   </w:style>
@@ -733,10 +702,12 @@
       <w:outlineLvl w:val="3"/>
     </w:pPr>
     <w:rPr>
-      <w:rFonts w:cstheme="majorBidi" w:eastAsiaTheme="majorEastAsia"/>
-      <w:i/>
+      <w:rFonts w:ascii="Times New Roman" w:cs="Times New Roman" w:eastAsia="Times New Roman" w:hAnsi="Times New Roman"/>
+      <w:b w:val="0"/>
+      <w:i w:val="0"/>
       <w:iCs/>
-      <w:color w:themeColor="accent1" w:themeShade="BF" w:val="0F4761"/>
+      <w:color w:val="000000"/>
+      <w:sz w:val="24"/>
     </w:rPr>
   </w:style>
   <w:style w:styleId="Heading5" w:type="paragraph">
@@ -756,8 +727,11 @@
       <w:outlineLvl w:val="4"/>
     </w:pPr>
     <w:rPr>
-      <w:rFonts w:cstheme="majorBidi" w:eastAsiaTheme="majorEastAsia"/>
-      <w:color w:themeColor="accent1" w:themeShade="BF" w:val="0F4761"/>
+      <w:rFonts w:ascii="Times New Roman" w:cs="Times New Roman" w:eastAsia="Times New Roman" w:hAnsi="Times New Roman"/>
+      <w:b w:val="0"/>
+      <w:i w:val="0"/>
+      <w:color w:val="000000"/>
+      <w:sz w:val="24"/>
     </w:rPr>
   </w:style>
   <w:style w:styleId="Heading6" w:type="paragraph">
@@ -777,10 +751,12 @@
       <w:outlineLvl w:val="5"/>
     </w:pPr>
     <w:rPr>
-      <w:rFonts w:cstheme="majorBidi" w:eastAsiaTheme="majorEastAsia"/>
-      <w:i/>
+      <w:rFonts w:ascii="Times New Roman" w:cs="Times New Roman" w:eastAsia="Times New Roman" w:hAnsi="Times New Roman"/>
+      <w:b w:val="0"/>
+      <w:i w:val="0"/>
       <w:iCs/>
-      <w:color w:themeColor="text1" w:themeTint="A6" w:val="595959"/>
+      <w:color w:val="000000"/>
+      <w:sz w:val="24"/>
     </w:rPr>
   </w:style>
   <w:style w:styleId="Heading7" w:type="paragraph">
@@ -800,8 +776,11 @@
       <w:outlineLvl w:val="6"/>
     </w:pPr>
     <w:rPr>
-      <w:rFonts w:cstheme="majorBidi" w:eastAsiaTheme="majorEastAsia"/>
-      <w:color w:themeColor="text1" w:themeTint="A6" w:val="595959"/>
+      <w:rFonts w:ascii="Times New Roman" w:cs="Times New Roman" w:eastAsia="Times New Roman" w:hAnsi="Times New Roman"/>
+      <w:b w:val="0"/>
+      <w:i w:val="0"/>
+      <w:color w:val="000000"/>
+      <w:sz w:val="24"/>
     </w:rPr>
   </w:style>
   <w:style w:styleId="Heading8" w:type="paragraph">
@@ -821,10 +800,12 @@
       <w:outlineLvl w:val="7"/>
     </w:pPr>
     <w:rPr>
-      <w:rFonts w:cstheme="majorBidi" w:eastAsiaTheme="majorEastAsia"/>
-      <w:i/>
+      <w:rFonts w:ascii="Times New Roman" w:cs="Times New Roman" w:eastAsia="Times New Roman" w:hAnsi="Times New Roman"/>
+      <w:b w:val="0"/>
+      <w:i w:val="0"/>
       <w:iCs/>
-      <w:color w:themeColor="text1" w:themeTint="D8" w:val="272727"/>
+      <w:color w:val="000000"/>
+      <w:sz w:val="24"/>
     </w:rPr>
   </w:style>
   <w:style w:styleId="Heading9" w:type="paragraph">
@@ -844,8 +825,11 @@
       <w:outlineLvl w:val="8"/>
     </w:pPr>
     <w:rPr>
-      <w:rFonts w:cstheme="majorBidi" w:eastAsiaTheme="majorEastAsia"/>
-      <w:color w:themeColor="text1" w:themeTint="D8" w:val="272727"/>
+      <w:rFonts w:ascii="Times New Roman" w:cs="Times New Roman" w:eastAsia="Times New Roman" w:hAnsi="Times New Roman"/>
+      <w:b w:val="0"/>
+      <w:i w:val="0"/>
+      <w:color w:val="000000"/>
+      <w:sz w:val="24"/>
     </w:rPr>
   </w:style>
   <w:style w:customStyle="1" w:styleId="Heading1Char" w:type="character">
@@ -855,8 +839,8 @@
     <w:uiPriority w:val="9"/>
     <w:rsid w:val="00A10FD9"/>
     <w:rPr>
-      <w:rFonts w:asciiTheme="majorHAnsi" w:cstheme="majorBidi" w:eastAsiaTheme="majorEastAsia" w:hAnsiTheme="majorHAnsi"/>
-      <w:color w:themeColor="accent1" w:themeShade="BF" w:val="0F4761"/>
+      <w:rFonts w:ascii="Times New Roman" w:cs="Times New Roman" w:eastAsia="Times New Roman" w:hAnsi="Times New Roman"/>
+      <w:color w:val="000000"/>
       <w:sz w:val="40"/>
       <w:szCs w:val="40"/>
     </w:rPr>
@@ -869,8 +853,8 @@
     <w:semiHidden/>
     <w:rsid w:val="00A10FD9"/>
     <w:rPr>
-      <w:rFonts w:asciiTheme="majorHAnsi" w:cstheme="majorBidi" w:eastAsiaTheme="majorEastAsia" w:hAnsiTheme="majorHAnsi"/>
-      <w:color w:themeColor="accent1" w:themeShade="BF" w:val="0F4761"/>
+      <w:rFonts w:ascii="Times New Roman" w:cs="Times New Roman" w:eastAsia="Times New Roman" w:hAnsi="Times New Roman"/>
+      <w:color w:val="000000"/>
       <w:sz w:val="32"/>
       <w:szCs w:val="32"/>
     </w:rPr>
@@ -883,8 +867,8 @@
     <w:semiHidden/>
     <w:rsid w:val="00A10FD9"/>
     <w:rPr>
-      <w:rFonts w:cstheme="majorBidi" w:eastAsiaTheme="majorEastAsia"/>
-      <w:color w:themeColor="accent1" w:themeShade="BF" w:val="0F4761"/>
+      <w:rFonts w:ascii="Times New Roman" w:cs="Times New Roman" w:eastAsia="Times New Roman" w:hAnsi="Times New Roman"/>
+      <w:color w:val="000000"/>
       <w:sz w:val="28"/>
       <w:szCs w:val="28"/>
     </w:rPr>
@@ -897,10 +881,10 @@
     <w:semiHidden/>
     <w:rsid w:val="00A10FD9"/>
     <w:rPr>
-      <w:rFonts w:cstheme="majorBidi" w:eastAsiaTheme="majorEastAsia"/>
+      <w:rFonts w:ascii="Times New Roman" w:cs="Times New Roman" w:eastAsia="Times New Roman" w:hAnsi="Times New Roman"/>
       <w:i/>
       <w:iCs/>
-      <w:color w:themeColor="accent1" w:themeShade="BF" w:val="0F4761"/>
+      <w:color w:val="000000"/>
     </w:rPr>
   </w:style>
   <w:style w:customStyle="1" w:styleId="Heading5Char" w:type="character">
@@ -911,8 +895,8 @@
     <w:semiHidden/>
     <w:rsid w:val="00A10FD9"/>
     <w:rPr>
-      <w:rFonts w:cstheme="majorBidi" w:eastAsiaTheme="majorEastAsia"/>
-      <w:color w:themeColor="accent1" w:themeShade="BF" w:val="0F4761"/>
+      <w:rFonts w:ascii="Times New Roman" w:cs="Times New Roman" w:eastAsia="Times New Roman" w:hAnsi="Times New Roman"/>
+      <w:color w:val="000000"/>
     </w:rPr>
   </w:style>
   <w:style w:customStyle="1" w:styleId="Heading6Char" w:type="character">
@@ -923,10 +907,10 @@
     <w:semiHidden/>
     <w:rsid w:val="00A10FD9"/>
     <w:rPr>
-      <w:rFonts w:cstheme="majorBidi" w:eastAsiaTheme="majorEastAsia"/>
+      <w:rFonts w:ascii="Times New Roman" w:cs="Times New Roman" w:eastAsia="Times New Roman" w:hAnsi="Times New Roman"/>
       <w:i/>
       <w:iCs/>
-      <w:color w:themeColor="text1" w:themeTint="A6" w:val="595959"/>
+      <w:color w:val="000000"/>
     </w:rPr>
   </w:style>
   <w:style w:customStyle="1" w:styleId="Heading7Char" w:type="character">
@@ -937,8 +921,8 @@
     <w:semiHidden/>
     <w:rsid w:val="00A10FD9"/>
     <w:rPr>
-      <w:rFonts w:cstheme="majorBidi" w:eastAsiaTheme="majorEastAsia"/>
-      <w:color w:themeColor="text1" w:themeTint="A6" w:val="595959"/>
+      <w:rFonts w:ascii="Times New Roman" w:cs="Times New Roman" w:eastAsia="Times New Roman" w:hAnsi="Times New Roman"/>
+      <w:color w:val="000000"/>
     </w:rPr>
   </w:style>
   <w:style w:customStyle="1" w:styleId="Heading8Char" w:type="character">
@@ -949,10 +933,10 @@
     <w:semiHidden/>
     <w:rsid w:val="00A10FD9"/>
     <w:rPr>
-      <w:rFonts w:cstheme="majorBidi" w:eastAsiaTheme="majorEastAsia"/>
+      <w:rFonts w:ascii="Times New Roman" w:cs="Times New Roman" w:eastAsia="Times New Roman" w:hAnsi="Times New Roman"/>
       <w:i/>
       <w:iCs/>
-      <w:color w:themeColor="text1" w:themeTint="D8" w:val="272727"/>
+      <w:color w:val="000000"/>
     </w:rPr>
   </w:style>
   <w:style w:customStyle="1" w:styleId="Heading9Char" w:type="character">
@@ -963,8 +947,8 @@
     <w:semiHidden/>
     <w:rsid w:val="00A10FD9"/>
     <w:rPr>
-      <w:rFonts w:cstheme="majorBidi" w:eastAsiaTheme="majorEastAsia"/>
-      <w:color w:themeColor="text1" w:themeTint="D8" w:val="272727"/>
+      <w:rFonts w:ascii="Times New Roman" w:cs="Times New Roman" w:eastAsia="Times New Roman" w:hAnsi="Times New Roman"/>
+      <w:color w:val="000000"/>
     </w:rPr>
   </w:style>
   <w:style w:styleId="BlockText" w:type="paragraph">
@@ -978,6 +962,9 @@
       <w:spacing w:after="100" w:before="100"/>
       <w:ind w:firstLine="0" w:left="480" w:right="480"/>
     </w:pPr>
+    <w:rPr>
+      <w:rFonts w:ascii="Times New Roman" w:hAnsi="Times New Roman"/>
+    </w:rPr>
   </w:style>
   <w:style w:styleId="FootnoteText" w:type="paragraph">
     <w:name w:val="Footnote Text"/>
@@ -986,6 +973,9 @@
     <w:uiPriority w:val="9"/>
     <w:unhideWhenUsed/>
     <w:qFormat/>
+    <w:rPr>
+      <w:rFonts w:ascii="Times New Roman" w:hAnsi="Times New Roman"/>
+    </w:rPr>
   </w:style>
   <w:style w:styleId="FootnoteBlockText" w:type="paragraph">
     <w:name w:val="Footnote Block Text"/>
@@ -998,6 +988,9 @@
       <w:spacing w:after="100" w:before="100"/>
       <w:ind w:firstLine="0" w:left="480" w:right="480"/>
     </w:pPr>
+    <w:rPr>
+      <w:rFonts w:ascii="Times New Roman" w:hAnsi="Times New Roman"/>
+    </w:rPr>
   </w:style>
   <w:style w:default="1" w:styleId="DefaultParagraphFont" w:type="character">
     <w:name w:val="Default Paragraph Font"/>
@@ -1038,12 +1031,16 @@
       <w:spacing w:after="0"/>
     </w:pPr>
     <w:rPr>
+      <w:rFonts w:ascii="Times New Roman" w:hAnsi="Times New Roman"/>
       <w:b/>
     </w:rPr>
   </w:style>
   <w:style w:customStyle="1" w:styleId="Definition" w:type="paragraph">
     <w:name w:val="Definition"/>
     <w:basedOn w:val="Normal"/>
+    <w:rPr>
+      <w:rFonts w:ascii="Times New Roman" w:hAnsi="Times New Roman"/>
+    </w:rPr>
   </w:style>
   <w:style w:styleId="Caption" w:type="paragraph">
     <w:name w:val="Caption"/>
@@ -1053,6 +1050,7 @@
       <w:spacing w:after="120" w:before="0"/>
     </w:pPr>
     <w:rPr>
+      <w:rFonts w:ascii="Times New Roman" w:hAnsi="Times New Roman"/>
       <w:i/>
     </w:rPr>
   </w:style>
@@ -1062,14 +1060,23 @@
     <w:pPr>
       <w:keepNext/>
     </w:pPr>
+    <w:rPr>
+      <w:rFonts w:ascii="Times New Roman" w:hAnsi="Times New Roman"/>
+    </w:rPr>
   </w:style>
   <w:style w:customStyle="1" w:styleId="ImageCaption" w:type="paragraph">
     <w:name w:val="Image Caption"/>
     <w:basedOn w:val="Caption"/>
+    <w:rPr>
+      <w:rFonts w:ascii="Times New Roman" w:hAnsi="Times New Roman"/>
+    </w:rPr>
   </w:style>
   <w:style w:customStyle="1" w:styleId="Figure" w:type="paragraph">
     <w:name w:val="Figure"/>
     <w:basedOn w:val="Normal"/>
+    <w:rPr>
+      <w:rFonts w:ascii="Times New Roman" w:hAnsi="Times New Roman"/>
+    </w:rPr>
   </w:style>
   <w:style w:customStyle="1" w:styleId="CaptionedFigure" w:type="paragraph">
     <w:name w:val="Captioned Figure"/>
@@ -1077,6 +1084,9 @@
     <w:pPr>
       <w:keepNext/>
     </w:pPr>
+    <w:rPr>
+      <w:rFonts w:ascii="Times New Roman" w:hAnsi="Times New Roman"/>
+    </w:rPr>
   </w:style>
   <w:style w:customStyle="1" w:styleId="BodyTextChar" w:type="character">
     <w:name w:val="Body Text Char"/>
@@ -1087,7 +1097,7 @@
     <w:name w:val="Verbatim Char"/>
     <w:basedOn w:val="BodyTextChar"/>
     <w:rPr>
-      <w:rFonts w:ascii="Consolas" w:hAnsi="Consolas"/>
+      <w:rFonts w:ascii="Times New Roman" w:cs="Times New Roman" w:eastAsia="Times New Roman" w:hAnsi="Times New Roman"/>
       <w:sz w:val="22"/>
     </w:rPr>
   </w:style>
@@ -1106,7 +1116,7 @@
     <w:name w:val="Hyperlink"/>
     <w:basedOn w:val="BodyTextChar"/>
     <w:rPr>
-      <w:color w:themeColor="accent1" w:val="4F81BD"/>
+      <w:color w:val="000000"/>
     </w:rPr>
   </w:style>
   <w:style w:styleId="TOCHeading" w:type="paragraph">
@@ -1121,10 +1131,10 @@
       <w:outlineLvl w:val="9"/>
     </w:pPr>
     <w:rPr>
-      <w:rFonts w:asciiTheme="majorHAnsi" w:cstheme="majorBidi" w:eastAsiaTheme="majorEastAsia" w:hAnsiTheme="majorHAnsi"/>
+      <w:rFonts w:ascii="Times New Roman" w:cs="Times New Roman" w:eastAsia="Times New Roman" w:hAnsi="Times New Roman"/>
       <w:b w:val="0"/>
       <w:bCs w:val="0"/>
-      <w:color w:themeColor="accent1" w:themeShade="BF" w:val="365F91"/>
+      <w:color w:val="000000"/>
     </w:rPr>
   </w:style>
   <w:style w:type="paragraph" w:customStyle="1" w:styleId="SourceCode">

</xml_diff>

<commit_message>
Move the address block in the cover letter below the signature
</commit_message>
<xml_diff>
--- a/docs/paper/submission/cover_letter.docx
+++ b/docs/paper/submission/cover_letter.docx
@@ -5,32 +5,6 @@
     <w:p>
       <w:pPr>
         <w:pStyle w:val="FirstParagraph"/>
-      </w:pPr>
-      <w:r>
-        <w:t xml:space="preserve">Md Rakib Hasan</w:t>
-      </w:r>
-      <w:r>
-        <w:br/>
-      </w:r>
-      <w:r>
-        <w:t xml:space="preserve">Department of Soil, Water and Environment, University of Dhaka, Dhaka-1000, Bangladesh</w:t>
-      </w:r>
-      <w:r>
-        <w:br/>
-      </w:r>
-      <w:r>
-        <w:t xml:space="preserve">Fermium Systems, Dhaka-1207, Bangladesh</w:t>
-      </w:r>
-      <w:r>
-        <w:br/>
-      </w:r>
-      <w:r>
-        <w:t xml:space="preserve">rakibhhridoy@fermium.systems · ORCID 0009-0002-4007-7590</w:t>
-      </w:r>
-    </w:p>
-    <w:p>
-      <w:pPr>
-        <w:pStyle w:val="BodyText"/>
       </w:pPr>
       <w:r>
         <w:t xml:space="preserve">24 October 2026</w:t>
@@ -188,6 +162,24 @@
       </w:pPr>
       <w:r>
         <w:t xml:space="preserve">Md Rakib Hasan</w:t>
+      </w:r>
+      <w:r>
+        <w:br/>
+      </w:r>
+      <w:r>
+        <w:t xml:space="preserve">Department of Soil, Water and Environment, University of Dhaka, Dhaka-1000, Bangladesh</w:t>
+      </w:r>
+      <w:r>
+        <w:br/>
+      </w:r>
+      <w:r>
+        <w:t xml:space="preserve">Fermium Systems, Dhaka-1207, Bangladesh</w:t>
+      </w:r>
+      <w:r>
+        <w:br/>
+      </w:r>
+      <w:r>
+        <w:t xml:space="preserve">rakibhhridoy@fermium.systems · ORCID 0009-0002-4007-7590</w:t>
       </w:r>
     </w:p>
     <w:sectPr>

</xml_diff>

<commit_message>
Justify cover letter text, drop the SoftwareX mention, put reviewer emails on their own lines
</commit_message>
<xml_diff>
--- a/docs/paper/submission/cover_letter.docx
+++ b/docs/paper/submission/cover_letter.docx
@@ -35,6 +35,7 @@
     <w:p>
       <w:pPr>
         <w:pStyle w:val="BodyText"/>
+        <w:jc w:val="both"/>
       </w:pPr>
       <w:r>
         <w:t xml:space="preserve">I am pleased to submit the manuscript</w:t>
@@ -55,6 +56,7 @@
     <w:p>
       <w:pPr>
         <w:pStyle w:val="BodyText"/>
+        <w:jc w:val="both"/>
       </w:pPr>
       <w:r>
         <w:t xml:space="preserve">Every flood manager in a radar-mapped region already holds a free flood map, the record of where floods have been, yet published flood susceptibility maps are almost never tested against it. The manuscript sets a gradient-boosted terrain model against that record on later floods mapped from Sentinel-1 radar, scoring both on 10 km blocks held out from training, and asks when the record is enough and when a model adds to it.</w:t>
@@ -63,6 +65,7 @@
     <w:p>
       <w:pPr>
         <w:pStyle w:val="BodyText"/>
+        <w:jc w:val="both"/>
       </w:pPr>
       <w:r>
         <w:t xml:space="preserve">Across 15 tests in seven regions, the record’s lead fell as the share of a flood reaching ground no earlier flood had reached rose (Spearman ρ = −0.775, p &lt; 0.001), and the two were level at about a third of flooded assets on new ground. The relation held with each region left out in turn. Where floods returned to the same ground the record won (AUC 0.896 against 0.801 in Rangpur and Rajshahi), and on the cyclone-affected coast the model led. A global hydrodynamic hazard map was no stronger than the model.</w:t>
@@ -71,6 +74,7 @@
     <w:p>
       <w:pPr>
         <w:pStyle w:val="BodyText"/>
+        <w:jc w:val="both"/>
       </w:pPr>
       <w:r>
         <w:t xml:space="preserve">The paper suits the Journal because its conclusions concern how flood risk is managed. It recommends that agencies publish the radar flood record as a planning baseline, and that the choice between record and model follow how much of past flooding fell on new ground. Its limits are stated plainly: scores measure agreement with flooding as radar sees it, 10 of the 15 tests cannot separate record from model, and all regions lie in one country. The code is at https://github.com/rakibhhridoy/rimes-mapathon and the data at https://doi.org/10.5281/zenodo.23573843.</w:t>
@@ -79,9 +83,10 @@
     <w:p>
       <w:pPr>
         <w:pStyle w:val="BodyText"/>
-      </w:pPr>
-      <w:r>
-        <w:t xml:space="preserve">The main text runs to just under 6,000 words with 5 figures and 7 tables, plus a Supporting Information file. The manuscript is original and not under consideration elsewhere. The software it uses is described in a separate manuscript under review at SoftwareX (SOFTX-D-26-01375), which reports the software rather than these findings. I am the sole author, declare an affiliation with Fermium Systems, which hosts the public dashboard, and received no specific funding.</w:t>
+        <w:jc w:val="both"/>
+      </w:pPr>
+      <w:r>
+        <w:t xml:space="preserve">The main text runs to just under 6,000 words with 5 figures and 7 tables, plus a Supporting Information file. The manuscript is original and not under consideration elsewhere. I am the sole author, declare an affiliation with Fermium Systems, which hosts the public dashboard, and received no specific funding.</w:t>
       </w:r>
     </w:p>
     <w:p>
@@ -101,8 +106,19 @@
         </w:numPr>
       </w:pPr>
       <w:r>
-        <w:t xml:space="preserve">Dr Beth Tellman, Nelson Institute for Environmental Studies, University of Wisconsin–Madison, USA. Beth.tellman@wisc.edu</w:t>
-      </w:r>
+        <w:t xml:space="preserve">Dr Beth Tellman, Nelson Institute for Environmental Studies, University of Wisconsin–Madison, USA.</w:t>
+      </w:r>
+      <w:r>
+        <w:br/>
+      </w:r>
+      <w:hyperlink r:id="rId9">
+        <w:r>
+          <w:rPr>
+            <w:rStyle w:val="Hyperlink"/>
+          </w:rPr>
+          <w:t xml:space="preserve">Beth.tellman@wisc.edu</w:t>
+        </w:r>
+      </w:hyperlink>
     </w:p>
     <w:p>
       <w:pPr>
@@ -113,8 +129,19 @@
         </w:numPr>
       </w:pPr>
       <w:r>
-        <w:t xml:space="preserve">Dr Sandro Martinis, German Remote Sensing Data Center, German Aerospace Center (DLR), Germany. Sandro.Martinis@dlr.de</w:t>
-      </w:r>
+        <w:t xml:space="preserve">Dr Sandro Martinis, German Remote Sensing Data Center, German Aerospace Center (DLR), Germany.</w:t>
+      </w:r>
+      <w:r>
+        <w:br/>
+      </w:r>
+      <w:hyperlink r:id="rId10">
+        <w:r>
+          <w:rPr>
+            <w:rStyle w:val="Hyperlink"/>
+          </w:rPr>
+          <w:t xml:space="preserve">Sandro.Martinis@dlr.de</w:t>
+        </w:r>
+      </w:hyperlink>
     </w:p>
     <w:p>
       <w:pPr>
@@ -125,8 +152,19 @@
         </w:numPr>
       </w:pPr>
       <w:r>
-        <w:t xml:space="preserve">Prof. Hanna Meyer, Institute of Landscape Ecology, University of Münster, Germany. hanna.meyer@uni-muenster.de</w:t>
-      </w:r>
+        <w:t xml:space="preserve">Prof. Hanna Meyer, Institute of Landscape Ecology, University of Münster, Germany.</w:t>
+      </w:r>
+      <w:r>
+        <w:br/>
+      </w:r>
+      <w:hyperlink r:id="rId11">
+        <w:r>
+          <w:rPr>
+            <w:rStyle w:val="Hyperlink"/>
+          </w:rPr>
+          <w:t xml:space="preserve">hanna.meyer@uni-muenster.de</w:t>
+        </w:r>
+      </w:hyperlink>
     </w:p>
     <w:p>
       <w:pPr>
@@ -137,8 +175,19 @@
         </w:numPr>
       </w:pPr>
       <w:r>
-        <w:t xml:space="preserve">Dr Alexandre Wadoux, James Cook University, Australia. alexandre.wadoux@yahoo.fr</w:t>
-      </w:r>
+        <w:t xml:space="preserve">Dr Alexandre Wadoux, James Cook University, Australia.</w:t>
+      </w:r>
+      <w:r>
+        <w:br/>
+      </w:r>
+      <w:hyperlink r:id="rId12">
+        <w:r>
+          <w:rPr>
+            <w:rStyle w:val="Hyperlink"/>
+          </w:rPr>
+          <w:t xml:space="preserve">alexandre.wadoux@yahoo.fr</w:t>
+        </w:r>
+      </w:hyperlink>
     </w:p>
     <w:p>
       <w:pPr>

</xml_diff>

<commit_message>
Fill the cover letter page with the persistence framing and robustness checks
</commit_message>
<xml_diff>
--- a/docs/paper/submission/cover_letter.docx
+++ b/docs/paper/submission/cover_letter.docx
@@ -59,7 +59,7 @@
         <w:jc w:val="both"/>
       </w:pPr>
       <w:r>
-        <w:t xml:space="preserve">Every flood manager in a radar-mapped region already holds a free flood map, the record of where floods have been, yet published flood susceptibility maps are almost never tested against it. The manuscript sets a gradient-boosted terrain model against that record on later floods mapped from Sentinel-1 radar, scoring both on 10 km blocks held out from training, and asks when the record is enough and when a model adds to it.</w:t>
+        <w:t xml:space="preserve">Every flood manager in a radar-mapped region already holds a free flood map, the record of where floods have been, yet published flood susceptibility maps are almost never tested against it. Weather and river forecasts must beat persistence before their skill is believed, while susceptibility studies in Bangladesh report areas under the ROC curve (AUC) of 0.87 to 0.98, usually from random splits of spatially clustered points that test a model beside its own training data. The manuscript sets a gradient-boosted terrain model against that record on later floods mapped from Sentinel-1 radar, scoring both on 10 km blocks held out from training, and asks when the record is enough and when a model adds to it.</w:t>
       </w:r>
     </w:p>
     <w:p>
@@ -68,7 +68,7 @@
         <w:jc w:val="both"/>
       </w:pPr>
       <w:r>
-        <w:t xml:space="preserve">Across 15 tests in seven regions, the record’s lead fell as the share of a flood reaching ground no earlier flood had reached rose (Spearman ρ = −0.775, p &lt; 0.001), and the two were level at about a third of flooded assets on new ground. The relation held with each region left out in turn. Where floods returned to the same ground the record won (AUC 0.896 against 0.801 in Rangpur and Rajshahi), and on the cyclone-affected coast the model led. A global hydrodynamic hazard map was no stronger than the model.</w:t>
+        <w:t xml:space="preserve">Across 15 tests in seven regions, the record’s lead fell as the share of a flood reaching ground no earlier flood had reached rose (Spearman ρ = −0.775, p &lt; 0.001), and the two were level at about a third of flooded assets on new ground (95 % interval 18–41 %, or 3–43 % when whole regions are resampled). The relation held with each region left out in turn and within every region with more than one test. Where floods returned to the same ground the record won (AUC 0.896 against 0.801 in Rangpur and Rajshahi) and kept its lead with masks re-mapped from a single satellite, with other training targets and with 40 km blocks, while on the cyclone-affected coast the model led. A global hydrodynamic hazard map was no stronger than the model.</w:t>
       </w:r>
     </w:p>
     <w:p>

</xml_diff>